<commit_message>
feat: update resume and add new projects to portfolio
</commit_message>
<xml_diff>
--- a/public/resume.docx
+++ b/public/resume.docx
@@ -1001,6 +1001,45 @@
           <w:spacing w:val="0"/>
           <w:color w:val="101014"/>
         </w:rPr>
+        <w:t xml:space="preserve">Pesona Hub Digi</w:t>
+      </w:r>
+      <w:r>
+        <w:rPr>
+          <w:rFonts w:ascii="Helvetica Neue" w:hAnsi="Helvetica Neue" w:cs="Helvetica Neue"/>
+          <w:sz w:val="27"/>
+          <w:sz-cs w:val="27"/>
+          <w:spacing w:val="0"/>
+          <w:color w:val="232326"/>
+        </w:rPr>
+        <w:t xml:space="preserve"> — digital data-hub platform built as a feature-sliced FastAPI monolith with object storage and a Nuxt/Vue front end. FastAPI, SQLModel, MySQL, Redis, MinIO.</w:t>
+      </w:r>
+    </w:p>
+    <w:p>
+      <w:pPr>
+        <w:ind w:left="720" w:first-line="-720"/>
+        <w:spacing w:after="80"/>
+      </w:pPr>
+      <w:r>
+        <w:rPr>
+          <w:rFonts w:ascii="Helvetica Neue" w:hAnsi="Helvetica Neue" w:cs="Helvetica Neue"/>
+          <w:sz w:val="27"/>
+          <w:sz-cs w:val="27"/>
+          <w:color w:val="101014"/>
+        </w:rPr>
+        <w:t xml:space="preserve"/>
+        <w:tab/>
+        <w:t xml:space="preserve">•</w:t>
+        <w:tab/>
+        <w:t xml:space="preserve"/>
+      </w:r>
+      <w:r>
+        <w:rPr>
+          <w:rFonts w:ascii="Helvetica Neue" w:hAnsi="Helvetica Neue" w:cs="Helvetica Neue"/>
+          <w:sz w:val="27"/>
+          <w:sz-cs w:val="27"/>
+          <w:spacing w:val="0"/>
+          <w:color w:val="101014"/>
+        </w:rPr>
         <w:t xml:space="preserve">Satu Data Jabar / Open Data Jabar</w:t>
       </w:r>
       <w:r>
@@ -1012,6 +1051,45 @@
           <w:color w:val="232326"/>
         </w:rPr>
         <w:t xml:space="preserve"> — province-wide public dataset platforms on one shared interoperability contract. Python, Flask, MeiliSearch.</w:t>
+      </w:r>
+    </w:p>
+    <w:p>
+      <w:pPr>
+        <w:ind w:left="720" w:first-line="-720"/>
+        <w:spacing w:after="80"/>
+      </w:pPr>
+      <w:r>
+        <w:rPr>
+          <w:rFonts w:ascii="Helvetica Neue" w:hAnsi="Helvetica Neue" w:cs="Helvetica Neue"/>
+          <w:sz w:val="27"/>
+          <w:sz-cs w:val="27"/>
+          <w:color w:val="101014"/>
+        </w:rPr>
+        <w:t xml:space="preserve"/>
+        <w:tab/>
+        <w:t xml:space="preserve">•</w:t>
+        <w:tab/>
+        <w:t xml:space="preserve"/>
+      </w:r>
+      <w:r>
+        <w:rPr>
+          <w:rFonts w:ascii="Helvetica Neue" w:hAnsi="Helvetica Neue" w:cs="Helvetica Neue"/>
+          <w:sz w:val="27"/>
+          <w:sz-cs w:val="27"/>
+          <w:spacing w:val="0"/>
+          <w:color w:val="101014"/>
+        </w:rPr>
+        <w:t xml:space="preserve">Cirebon Open-Data Portal</w:t>
+      </w:r>
+      <w:r>
+        <w:rPr>
+          <w:rFonts w:ascii="Helvetica Neue" w:hAnsi="Helvetica Neue" w:cs="Helvetica Neue"/>
+          <w:sz w:val="27"/>
+          <w:sz-cs w:val="27"/>
+          <w:spacing w:val="0"/>
+          <w:color w:val="232326"/>
+        </w:rPr>
+        <w:t xml:space="preserve"> — public front end for a city open-data portal with interactive visualizations and server-state caching. Next.js, React, TypeScript.</w:t>
       </w:r>
     </w:p>
     <w:p>

</xml_diff>